<commit_message>
Delete GCA analyzer project
</commit_message>
<xml_diff>
--- a/assets/pdf/Xiao_Jianjun_Resume_CN.docx
+++ b/assets/pdf/Xiao_Jianjun_Resume_CN.docx
@@ -1127,8 +1127,8 @@
           <w:ilvl w:val="0"/>
           <w:numId w:val="0"/>
         </w:numPr>
-        <w:spacing w:after="14" w:line="240" w:lineRule="auto"/>
-        <w:ind w:left="360" w:hanging="360"/>
+        <w:spacing w:beforeLines="50" w:before="120" w:after="14" w:line="240" w:lineRule="auto"/>
+        <w:ind w:left="357" w:hanging="357"/>
         <w:rPr>
           <w:bCs/>
           <w:lang w:eastAsia="zh-CN"/>
@@ -1488,8 +1488,8 @@
           <w:ilvl w:val="0"/>
           <w:numId w:val="0"/>
         </w:numPr>
-        <w:spacing w:after="14" w:line="240" w:lineRule="auto"/>
-        <w:ind w:left="360" w:hanging="360"/>
+        <w:spacing w:beforeLines="50" w:before="120" w:after="14" w:line="240" w:lineRule="auto"/>
+        <w:ind w:left="357" w:hanging="357"/>
         <w:rPr>
           <w:bCs/>
           <w:lang w:eastAsia="zh-CN"/>
@@ -1999,8 +1999,8 @@
     <w:p>
       <w:pPr>
         <w:pStyle w:val="a0"/>
-        <w:spacing w:after="14" w:line="240" w:lineRule="auto"/>
-        <w:ind w:left="259" w:hanging="173"/>
+        <w:spacing w:beforeLines="50" w:before="120" w:after="14" w:line="240" w:lineRule="auto"/>
+        <w:ind w:left="261" w:hanging="176"/>
         <w:rPr>
           <w:lang w:eastAsia="zh-CN"/>
         </w:rPr>
@@ -3020,25 +3020,7 @@
           <w:color w:val="232323"/>
           <w:sz w:val="17"/>
         </w:rPr>
-        <w:t xml:space="preserve">, Wang, C., Zhang, W. (2026). Modeling Collaborative </w:t>
-      </w:r>
-      <w:proofErr w:type="gramStart"/>
-      <w:r>
-        <w:rPr>
-          <w:bCs/>
-          <w:color w:val="232323"/>
-          <w:sz w:val="17"/>
-        </w:rPr>
-        <w:t>Problem Solving</w:t>
-      </w:r>
-      <w:proofErr w:type="gramEnd"/>
-      <w:r>
-        <w:rPr>
-          <w:bCs/>
-          <w:color w:val="232323"/>
-          <w:sz w:val="17"/>
-        </w:rPr>
-        <w:t xml:space="preserve"> Dynamics from Group Discourse: A Text-Mining Approach with Synergy Degree Model. </w:t>
+        <w:t xml:space="preserve">, Wang, C., Zhang, W. (2026). Modeling Collaborative Problem Solving Dynamics from Group Discourse: A Text-Mining Approach with Synergy Degree Model. </w:t>
       </w:r>
       <w:r>
         <w:rPr>
@@ -3376,7 +3358,7 @@
           <w:color w:val="2D2D2D"/>
           <w:lang w:eastAsia="zh-CN"/>
         </w:rPr>
-        <w:t>GCA</w:t>
+        <w:t>AICO</w:t>
       </w:r>
       <w:r>
         <w:rPr>
@@ -3384,22 +3366,79 @@
           <w:color w:val="181818"/>
           <w:sz w:val="19"/>
         </w:rPr>
-        <w:t xml:space="preserve"> Analyzer: Group Communication Analysis Tool</w:t>
-      </w:r>
-      <w:r>
-        <w:rPr>
+        <w:t xml:space="preserve">: An </w:t>
+      </w:r>
+      <w:r>
+        <w:rPr>
+          <w:rFonts w:hint="eastAsia"/>
           <w:bCs/>
           <w:color w:val="181818"/>
           <w:sz w:val="19"/>
           <w:lang w:eastAsia="zh-CN"/>
         </w:rPr>
-        <w:tab/>
+        <w:t>A</w:t>
       </w:r>
       <w:r>
         <w:rPr>
           <w:bCs/>
           <w:color w:val="181818"/>
           <w:sz w:val="19"/>
+        </w:rPr>
+        <w:t xml:space="preserve">rtificial </w:t>
+      </w:r>
+      <w:r>
+        <w:rPr>
+          <w:bCs/>
+          <w:color w:val="181818"/>
+          <w:sz w:val="19"/>
+        </w:rPr>
+        <w:t>I</w:t>
+      </w:r>
+      <w:r>
+        <w:rPr>
+          <w:bCs/>
+          <w:color w:val="181818"/>
+          <w:sz w:val="19"/>
+        </w:rPr>
+        <w:t xml:space="preserve">ntelligence </w:t>
+      </w:r>
+      <w:r>
+        <w:rPr>
+          <w:bCs/>
+          <w:color w:val="181818"/>
+          <w:sz w:val="19"/>
+        </w:rPr>
+        <w:t>T</w:t>
+      </w:r>
+      <w:r>
+        <w:rPr>
+          <w:bCs/>
+          <w:color w:val="181818"/>
+          <w:sz w:val="19"/>
+        </w:rPr>
+        <w:t xml:space="preserve">ext-coding </w:t>
+      </w:r>
+      <w:r>
+        <w:rPr>
+          <w:bCs/>
+          <w:color w:val="181818"/>
+          <w:sz w:val="19"/>
+        </w:rPr>
+        <w:t>O</w:t>
+      </w:r>
+      <w:r>
+        <w:rPr>
+          <w:bCs/>
+          <w:color w:val="181818"/>
+          <w:sz w:val="19"/>
+        </w:rPr>
+        <w:t>fficer</w:t>
+      </w:r>
+      <w:r>
+        <w:rPr>
+          <w:bCs/>
+          <w:color w:val="181818"/>
+          <w:sz w:val="19"/>
           <w:lang w:eastAsia="zh-CN"/>
         </w:rPr>
         <w:tab/>
@@ -3407,8 +3446,8 @@
       <w:r>
         <w:rPr>
           <w:bCs/>
-          <w:color w:val="5F5F5F"/>
-          <w:sz w:val="17"/>
+          <w:color w:val="181818"/>
+          <w:sz w:val="19"/>
           <w:lang w:eastAsia="zh-CN"/>
         </w:rPr>
         <w:tab/>
@@ -3463,8 +3502,26 @@
           <w:bCs/>
           <w:color w:val="5F5F5F"/>
           <w:sz w:val="17"/>
-        </w:rPr>
-        <w:t>2025</w:t>
+          <w:lang w:eastAsia="zh-CN"/>
+        </w:rPr>
+        <w:tab/>
+      </w:r>
+      <w:r>
+        <w:rPr>
+          <w:bCs/>
+          <w:color w:val="5F5F5F"/>
+          <w:sz w:val="17"/>
+          <w:lang w:eastAsia="zh-CN"/>
+        </w:rPr>
+        <w:tab/>
+      </w:r>
+      <w:r>
+        <w:rPr>
+          <w:bCs/>
+          <w:color w:val="5F5F5F"/>
+          <w:sz w:val="17"/>
+        </w:rPr>
+        <w:t>2024</w:t>
       </w:r>
     </w:p>
     <w:p>
@@ -3487,297 +3544,6 @@
           <w:color w:val="2D2D2D"/>
           <w:lang w:eastAsia="zh-CN"/>
         </w:rPr>
-        <w:t>基于大语言模型</w:t>
-      </w:r>
-      <w:r>
-        <w:rPr>
-          <w:rFonts w:ascii="宋体" w:eastAsia="宋体" w:hAnsi="宋体" w:cs="宋体" w:hint="eastAsia"/>
-          <w:bCs/>
-          <w:color w:val="2D2D2D"/>
-          <w:lang w:eastAsia="zh-CN"/>
-        </w:rPr>
-        <w:t>与</w:t>
-      </w:r>
-      <w:r>
-        <w:rPr>
-          <w:bCs/>
-          <w:color w:val="2D2D2D"/>
-          <w:lang w:eastAsia="zh-CN"/>
-        </w:rPr>
-        <w:t>计算语言学</w:t>
-      </w:r>
-      <w:r>
-        <w:rPr>
-          <w:rFonts w:ascii="宋体" w:eastAsia="宋体" w:hAnsi="宋体" w:cs="宋体" w:hint="eastAsia"/>
-          <w:bCs/>
-          <w:color w:val="2D2D2D"/>
-          <w:lang w:eastAsia="zh-CN"/>
-        </w:rPr>
-        <w:t>开发的群体</w:t>
-      </w:r>
-      <w:r>
-        <w:rPr>
-          <w:bCs/>
-          <w:color w:val="2D2D2D"/>
-          <w:lang w:eastAsia="zh-CN"/>
-        </w:rPr>
-        <w:t>话语分析工具</w:t>
-      </w:r>
-      <w:r>
-        <w:rPr>
-          <w:rFonts w:ascii="宋体" w:eastAsia="宋体" w:hAnsi="宋体" w:cs="宋体" w:hint="eastAsia"/>
-          <w:bCs/>
-          <w:color w:val="5F5F5F"/>
-          <w:sz w:val="17"/>
-          <w:lang w:eastAsia="ja-JP"/>
-        </w:rPr>
-        <w:t>（</w:t>
-      </w:r>
-      <w:r>
-        <w:rPr>
-          <w:rFonts w:ascii="宋体" w:eastAsia="宋体" w:hAnsi="宋体" w:cs="宋体" w:hint="eastAsia"/>
-          <w:bCs/>
-          <w:color w:val="5F5F5F"/>
-          <w:sz w:val="17"/>
-          <w:lang w:eastAsia="zh-CN"/>
-        </w:rPr>
-        <w:t>Python包）</w:t>
-      </w:r>
-      <w:r>
-        <w:rPr>
-          <w:bCs/>
-          <w:color w:val="2D2D2D"/>
-          <w:lang w:eastAsia="zh-CN"/>
-        </w:rPr>
-        <w:br/>
-      </w:r>
-      <w:r>
-        <w:rPr>
-          <w:bCs/>
-          <w:color w:val="2D2D2D"/>
-          <w:lang w:eastAsia="zh-CN"/>
-        </w:rPr>
-        <w:t>截至2026年9月</w:t>
-      </w:r>
-      <w:r>
-        <w:rPr>
-          <w:rFonts w:ascii="宋体" w:eastAsia="宋体" w:hAnsi="宋体" w:cs="宋体" w:hint="eastAsia"/>
-          <w:bCs/>
-          <w:color w:val="2D2D2D"/>
-          <w:lang w:eastAsia="zh-CN"/>
-        </w:rPr>
-        <w:t>累计</w:t>
-      </w:r>
-      <w:r>
-        <w:rPr>
-          <w:bCs/>
-          <w:color w:val="2D2D2D"/>
-          <w:lang w:eastAsia="zh-CN"/>
-        </w:rPr>
-        <w:t>下载量超过10,000次</w:t>
-      </w:r>
-    </w:p>
-    <w:p>
-      <w:pPr>
-        <w:pStyle w:val="a0"/>
-        <w:spacing w:after="14" w:line="240" w:lineRule="auto"/>
-        <w:ind w:left="259" w:hanging="173"/>
-        <w:rPr>
-          <w:bCs/>
-        </w:rPr>
-      </w:pPr>
-      <w:r>
-        <w:rPr>
-          <w:bCs/>
-          <w:color w:val="2D2D2D"/>
-          <w:lang w:eastAsia="zh-CN"/>
-        </w:rPr>
-        <w:t>AICO</w:t>
-      </w:r>
-      <w:r>
-        <w:rPr>
-          <w:bCs/>
-          <w:color w:val="181818"/>
-          <w:sz w:val="19"/>
-        </w:rPr>
-        <w:t xml:space="preserve">: An </w:t>
-      </w:r>
-      <w:r>
-        <w:rPr>
-          <w:rFonts w:hint="eastAsia"/>
-          <w:bCs/>
-          <w:color w:val="181818"/>
-          <w:sz w:val="19"/>
-          <w:lang w:eastAsia="zh-CN"/>
-        </w:rPr>
-        <w:t>A</w:t>
-      </w:r>
-      <w:r>
-        <w:rPr>
-          <w:bCs/>
-          <w:color w:val="181818"/>
-          <w:sz w:val="19"/>
-        </w:rPr>
-        <w:t xml:space="preserve">rtificial </w:t>
-      </w:r>
-      <w:r>
-        <w:rPr>
-          <w:bCs/>
-          <w:color w:val="181818"/>
-          <w:sz w:val="19"/>
-        </w:rPr>
-        <w:t>I</w:t>
-      </w:r>
-      <w:r>
-        <w:rPr>
-          <w:bCs/>
-          <w:color w:val="181818"/>
-          <w:sz w:val="19"/>
-        </w:rPr>
-        <w:t xml:space="preserve">ntelligence </w:t>
-      </w:r>
-      <w:r>
-        <w:rPr>
-          <w:bCs/>
-          <w:color w:val="181818"/>
-          <w:sz w:val="19"/>
-        </w:rPr>
-        <w:t>T</w:t>
-      </w:r>
-      <w:r>
-        <w:rPr>
-          <w:bCs/>
-          <w:color w:val="181818"/>
-          <w:sz w:val="19"/>
-        </w:rPr>
-        <w:t xml:space="preserve">ext-coding </w:t>
-      </w:r>
-      <w:r>
-        <w:rPr>
-          <w:bCs/>
-          <w:color w:val="181818"/>
-          <w:sz w:val="19"/>
-        </w:rPr>
-        <w:t>O</w:t>
-      </w:r>
-      <w:r>
-        <w:rPr>
-          <w:bCs/>
-          <w:color w:val="181818"/>
-          <w:sz w:val="19"/>
-        </w:rPr>
-        <w:t>fficer</w:t>
-      </w:r>
-      <w:r>
-        <w:rPr>
-          <w:bCs/>
-          <w:color w:val="181818"/>
-          <w:sz w:val="19"/>
-          <w:lang w:eastAsia="zh-CN"/>
-        </w:rPr>
-        <w:tab/>
-      </w:r>
-      <w:r>
-        <w:rPr>
-          <w:bCs/>
-          <w:color w:val="181818"/>
-          <w:sz w:val="19"/>
-          <w:lang w:eastAsia="zh-CN"/>
-        </w:rPr>
-        <w:tab/>
-      </w:r>
-      <w:r>
-        <w:rPr>
-          <w:bCs/>
-          <w:color w:val="5F5F5F"/>
-          <w:sz w:val="17"/>
-          <w:lang w:eastAsia="zh-CN"/>
-        </w:rPr>
-        <w:tab/>
-      </w:r>
-      <w:r>
-        <w:rPr>
-          <w:bCs/>
-          <w:color w:val="5F5F5F"/>
-          <w:sz w:val="17"/>
-          <w:lang w:eastAsia="zh-CN"/>
-        </w:rPr>
-        <w:tab/>
-      </w:r>
-      <w:r>
-        <w:rPr>
-          <w:bCs/>
-          <w:color w:val="5F5F5F"/>
-          <w:sz w:val="17"/>
-          <w:lang w:eastAsia="zh-CN"/>
-        </w:rPr>
-        <w:tab/>
-      </w:r>
-      <w:r>
-        <w:rPr>
-          <w:bCs/>
-          <w:color w:val="5F5F5F"/>
-          <w:sz w:val="17"/>
-          <w:lang w:eastAsia="zh-CN"/>
-        </w:rPr>
-        <w:tab/>
-      </w:r>
-      <w:r>
-        <w:rPr>
-          <w:bCs/>
-          <w:color w:val="5F5F5F"/>
-          <w:sz w:val="17"/>
-          <w:lang w:eastAsia="zh-CN"/>
-        </w:rPr>
-        <w:tab/>
-      </w:r>
-      <w:r>
-        <w:rPr>
-          <w:bCs/>
-          <w:color w:val="5F5F5F"/>
-          <w:sz w:val="17"/>
-          <w:lang w:eastAsia="zh-CN"/>
-        </w:rPr>
-        <w:tab/>
-      </w:r>
-      <w:r>
-        <w:rPr>
-          <w:bCs/>
-          <w:color w:val="5F5F5F"/>
-          <w:sz w:val="17"/>
-          <w:lang w:eastAsia="zh-CN"/>
-        </w:rPr>
-        <w:tab/>
-      </w:r>
-      <w:r>
-        <w:rPr>
-          <w:bCs/>
-          <w:color w:val="5F5F5F"/>
-          <w:sz w:val="17"/>
-        </w:rPr>
-        <w:t>2024</w:t>
-      </w:r>
-    </w:p>
-    <w:p>
-      <w:pPr>
-        <w:pStyle w:val="a0"/>
-        <w:numPr>
-          <w:ilvl w:val="0"/>
-          <w:numId w:val="0"/>
-        </w:numPr>
-        <w:spacing w:after="14" w:line="240" w:lineRule="auto"/>
-        <w:ind w:left="259"/>
-        <w:rPr>
-          <w:bCs/>
-          <w:lang w:eastAsia="zh-CN"/>
-        </w:rPr>
-      </w:pPr>
-      <w:r>
-        <w:rPr>
-          <w:bCs/>
-          <w:color w:val="2D2D2D"/>
-          <w:lang w:eastAsia="zh-CN"/>
-        </w:rPr>
         <w:t>基于大语言模型的教育文本分类应用</w:t>
       </w:r>
       <w:r>
@@ -4565,196 +4331,6 @@
           <w:lang w:eastAsia="zh-CN"/>
         </w:rPr>
         <w:t>2026</w:t>
-      </w:r>
-    </w:p>
-    <w:p>
-      <w:pPr>
-        <w:pStyle w:val="a0"/>
-        <w:spacing w:after="14" w:line="240" w:lineRule="auto"/>
-        <w:ind w:left="259" w:hanging="173"/>
-        <w:rPr>
-          <w:bCs/>
-          <w:lang w:eastAsia="zh-CN"/>
-        </w:rPr>
-      </w:pPr>
-      <w:r>
-        <w:rPr>
-          <w:rFonts w:ascii="宋体" w:eastAsia="宋体" w:hAnsi="宋体" w:cs="宋体" w:hint="eastAsia"/>
-          <w:bCs/>
-          <w:color w:val="2D2D2D"/>
-          <w:lang w:eastAsia="zh-CN"/>
-        </w:rPr>
-        <w:t>一等学业</w:t>
-      </w:r>
-      <w:r>
-        <w:rPr>
-          <w:rFonts w:ascii="宋体" w:eastAsia="宋体" w:hAnsi="宋体" w:cs="宋体"/>
-          <w:bCs/>
-          <w:color w:val="2D2D2D"/>
-          <w:lang w:eastAsia="zh-CN"/>
-        </w:rPr>
-        <w:t>奖</w:t>
-      </w:r>
-      <w:r>
-        <w:rPr>
-          <w:rFonts w:ascii="宋体" w:eastAsia="宋体" w:hAnsi="宋体" w:cs="宋体" w:hint="eastAsia"/>
-          <w:bCs/>
-          <w:color w:val="2D2D2D"/>
-          <w:lang w:eastAsia="zh-CN"/>
-        </w:rPr>
-        <w:t>学金</w:t>
-      </w:r>
-      <w:r>
-        <w:rPr>
-          <w:rFonts w:ascii="宋体" w:eastAsia="宋体" w:hAnsi="宋体" w:cs="宋体"/>
-          <w:bCs/>
-          <w:color w:val="2D2D2D"/>
-          <w:lang w:eastAsia="zh-CN"/>
-        </w:rPr>
-        <w:t xml:space="preserve"> </w:t>
-      </w:r>
-      <w:r>
-        <w:rPr>
-          <w:rFonts w:ascii="宋体" w:eastAsia="宋体" w:hAnsi="宋体" w:cs="宋体"/>
-          <w:bCs/>
-          <w:color w:val="2D2D2D"/>
-          <w:lang w:eastAsia="zh-CN"/>
-        </w:rPr>
-        <w:tab/>
-      </w:r>
-      <w:r>
-        <w:rPr>
-          <w:bCs/>
-          <w:color w:val="5F5F5F"/>
-          <w:sz w:val="17"/>
-          <w:lang w:eastAsia="zh-CN"/>
-        </w:rPr>
-        <w:tab/>
-      </w:r>
-      <w:r>
-        <w:rPr>
-          <w:bCs/>
-          <w:color w:val="5F5F5F"/>
-          <w:sz w:val="17"/>
-          <w:lang w:eastAsia="zh-CN"/>
-        </w:rPr>
-        <w:tab/>
-      </w:r>
-      <w:r>
-        <w:rPr>
-          <w:bCs/>
-          <w:color w:val="5F5F5F"/>
-          <w:sz w:val="17"/>
-          <w:lang w:eastAsia="zh-CN"/>
-        </w:rPr>
-        <w:tab/>
-      </w:r>
-      <w:r>
-        <w:rPr>
-          <w:bCs/>
-          <w:color w:val="5F5F5F"/>
-          <w:sz w:val="17"/>
-          <w:lang w:eastAsia="zh-CN"/>
-        </w:rPr>
-        <w:tab/>
-        <w:t>北京师范大学</w:t>
-      </w:r>
-      <w:r>
-        <w:rPr>
-          <w:bCs/>
-          <w:color w:val="5F5F5F"/>
-          <w:sz w:val="17"/>
-          <w:lang w:eastAsia="zh-CN"/>
-        </w:rPr>
-        <w:tab/>
-      </w:r>
-      <w:r>
-        <w:rPr>
-          <w:bCs/>
-          <w:color w:val="5F5F5F"/>
-          <w:sz w:val="17"/>
-          <w:lang w:eastAsia="zh-CN"/>
-        </w:rPr>
-        <w:tab/>
-      </w:r>
-      <w:r>
-        <w:rPr>
-          <w:bCs/>
-          <w:color w:val="5F5F5F"/>
-          <w:sz w:val="17"/>
-          <w:lang w:eastAsia="zh-CN"/>
-        </w:rPr>
-        <w:tab/>
-      </w:r>
-      <w:r>
-        <w:rPr>
-          <w:rFonts w:hint="eastAsia"/>
-          <w:bCs/>
-          <w:color w:val="5F5F5F"/>
-          <w:sz w:val="17"/>
-          <w:lang w:eastAsia="zh-CN"/>
-        </w:rPr>
-        <w:t xml:space="preserve">              2021</w:t>
-      </w:r>
-      <w:r>
-        <w:rPr>
-          <w:rFonts w:ascii="宋体" w:eastAsia="宋体" w:hAnsi="宋体" w:cs="宋体" w:hint="eastAsia"/>
-          <w:bCs/>
-          <w:color w:val="5F5F5F"/>
-          <w:sz w:val="17"/>
-          <w:lang w:eastAsia="zh-CN"/>
-        </w:rPr>
-        <w:t>、</w:t>
-      </w:r>
-      <w:r>
-        <w:rPr>
-          <w:rFonts w:hint="eastAsia"/>
-          <w:bCs/>
-          <w:color w:val="5F5F5F"/>
-          <w:sz w:val="17"/>
-          <w:lang w:eastAsia="zh-CN"/>
-        </w:rPr>
-        <w:t>2023</w:t>
-      </w:r>
-      <w:r>
-        <w:rPr>
-          <w:rFonts w:ascii="宋体" w:eastAsia="宋体" w:hAnsi="宋体" w:cs="宋体" w:hint="eastAsia"/>
-          <w:bCs/>
-          <w:color w:val="5F5F5F"/>
-          <w:sz w:val="17"/>
-          <w:lang w:eastAsia="zh-CN"/>
-        </w:rPr>
-        <w:t>、</w:t>
-      </w:r>
-      <w:r>
-        <w:rPr>
-          <w:rFonts w:hint="eastAsia"/>
-          <w:bCs/>
-          <w:color w:val="5F5F5F"/>
-          <w:sz w:val="17"/>
-          <w:lang w:eastAsia="zh-CN"/>
-        </w:rPr>
-        <w:t>2024</w:t>
-      </w:r>
-      <w:r>
-        <w:rPr>
-          <w:rFonts w:ascii="宋体" w:eastAsia="宋体" w:hAnsi="宋体" w:cs="宋体" w:hint="eastAsia"/>
-          <w:bCs/>
-          <w:color w:val="5F5F5F"/>
-          <w:sz w:val="17"/>
-          <w:lang w:eastAsia="zh-CN"/>
-        </w:rPr>
-        <w:t>、</w:t>
-      </w:r>
-      <w:r>
-        <w:rPr>
-          <w:rFonts w:hint="eastAsia"/>
-          <w:bCs/>
-          <w:color w:val="5F5F5F"/>
-          <w:sz w:val="17"/>
-          <w:lang w:eastAsia="zh-CN"/>
-        </w:rPr>
-        <w:t>2025</w:t>
       </w:r>
     </w:p>
     <w:p>

</xml_diff>